<commit_message>
Added Assignment 1 docx and .py files. (Incomplete)
</commit_message>
<xml_diff>
--- a/Assignment 1/Assignment 1 outline.docx
+++ b/Assignment 1/Assignment 1 outline.docx
@@ -1,12 +1,11 @@
 
 <file path=word/document.xml><?xml version="1.0" encoding="utf-8"?>
-<w:document xmlns:wpc="http://schemas.microsoft.com/office/word/2010/wordprocessingCanvas" xmlns:cx="http://schemas.microsoft.com/office/drawing/2014/chartex" xmlns:cx1="http://schemas.microsoft.com/office/drawing/2015/9/8/chartex" xmlns:cx2="http://schemas.microsoft.com/office/drawing/2015/10/21/chartex" xmlns:cx3="http://schemas.microsoft.com/office/drawing/2016/5/9/chartex" xmlns:cx4="http://schemas.microsoft.com/office/drawing/2016/5/10/chartex" xmlns:cx5="http://schemas.microsoft.com/office/drawing/2016/5/11/chartex" xmlns:cx6="http://schemas.microsoft.com/office/drawing/2016/5/12/chartex" xmlns:cx7="http://schemas.microsoft.com/office/drawing/2016/5/13/chartex" xmlns:cx8="http://schemas.microsoft.com/office/drawing/2016/5/14/chartex" xmlns:mc="http://schemas.openxmlformats.org/markup-compatibility/2006" xmlns:aink="http://schemas.microsoft.com/office/drawing/2016/ink" xmlns:am3d="http://schemas.microsoft.com/office/drawing/2017/model3d" xmlns:o="urn:schemas-microsoft-com:office:office" xmlns:r="http://schemas.openxmlformats.org/officeDocument/2006/relationships" xmlns:m="http://schemas.openxmlformats.org/officeDocument/2006/math" xmlns:v="urn:schemas-microsoft-com:vml" xmlns:wp14="http://schemas.microsoft.com/office/word/2010/wordprocessingDrawing" xmlns:wp="http://schemas.openxmlformats.org/drawingml/2006/wordprocessingDrawing" xmlns:w10="urn:schemas-microsoft-com:office:word" xmlns:w="http://schemas.openxmlformats.org/wordprocessingml/2006/main" xmlns:w14="http://schemas.microsoft.com/office/word/2010/wordml" xmlns:w15="http://schemas.microsoft.com/office/word/2012/wordml" xmlns:w16cid="http://schemas.microsoft.com/office/word/2016/wordml/cid" xmlns:w16se="http://schemas.microsoft.com/office/word/2015/wordml/symex" xmlns:wpg="http://schemas.microsoft.com/office/word/2010/wordprocessingGroup" xmlns:wpi="http://schemas.microsoft.com/office/word/2010/wordprocessingInk" xmlns:wne="http://schemas.microsoft.com/office/word/2006/wordml" xmlns:wps="http://schemas.microsoft.com/office/word/2010/wordprocessingShape" mc:Ignorable="w14 w15 w16se w16cid wp14">
+<w:document xmlns:wpc="http://schemas.microsoft.com/office/word/2010/wordprocessingCanvas" xmlns:cx="http://schemas.microsoft.com/office/drawing/2014/chartex" xmlns:cx1="http://schemas.microsoft.com/office/drawing/2015/9/8/chartex" xmlns:cx2="http://schemas.microsoft.com/office/drawing/2015/10/21/chartex" xmlns:cx3="http://schemas.microsoft.com/office/drawing/2016/5/9/chartex" xmlns:cx4="http://schemas.microsoft.com/office/drawing/2016/5/10/chartex" xmlns:cx5="http://schemas.microsoft.com/office/drawing/2016/5/11/chartex" xmlns:cx6="http://schemas.microsoft.com/office/drawing/2016/5/12/chartex" xmlns:cx7="http://schemas.microsoft.com/office/drawing/2016/5/13/chartex" xmlns:cx8="http://schemas.microsoft.com/office/drawing/2016/5/14/chartex" xmlns:mc="http://schemas.openxmlformats.org/markup-compatibility/2006" xmlns:aink="http://schemas.microsoft.com/office/drawing/2016/ink" xmlns:am3d="http://schemas.microsoft.com/office/drawing/2017/model3d" xmlns:o="urn:schemas-microsoft-com:office:office" xmlns:oel="http://schemas.microsoft.com/office/2019/extlst" xmlns:r="http://schemas.openxmlformats.org/officeDocument/2006/relationships" xmlns:m="http://schemas.openxmlformats.org/officeDocument/2006/math" xmlns:v="urn:schemas-microsoft-com:vml" xmlns:wp14="http://schemas.microsoft.com/office/word/2010/wordprocessingDrawing" xmlns:wp="http://schemas.openxmlformats.org/drawingml/2006/wordprocessingDrawing" xmlns:w10="urn:schemas-microsoft-com:office:word" xmlns:w="http://schemas.openxmlformats.org/wordprocessingml/2006/main" xmlns:w14="http://schemas.microsoft.com/office/word/2010/wordml" xmlns:w15="http://schemas.microsoft.com/office/word/2012/wordml" xmlns:w16cex="http://schemas.microsoft.com/office/word/2018/wordml/cex" xmlns:w16cid="http://schemas.microsoft.com/office/word/2016/wordml/cid" xmlns:w16="http://schemas.microsoft.com/office/word/2018/wordml" xmlns:w16du="http://schemas.microsoft.com/office/word/2023/wordml/word16du" xmlns:w16sdtdh="http://schemas.microsoft.com/office/word/2020/wordml/sdtdatahash" xmlns:w16sdtfl="http://schemas.microsoft.com/office/word/2024/wordml/sdtformatlock" xmlns:w16se="http://schemas.microsoft.com/office/word/2015/wordml/symex" xmlns:wpg="http://schemas.microsoft.com/office/word/2010/wordprocessingGroup" xmlns:wpi="http://schemas.microsoft.com/office/word/2010/wordprocessingInk" xmlns:wne="http://schemas.microsoft.com/office/word/2006/wordml" xmlns:wps="http://schemas.microsoft.com/office/word/2010/wordprocessingShape" mc:Ignorable="w14 w15 w16se w16cid w16 w16cex w16sdtdh w16sdtfl w16du wp14">
   <w:body>
     <w:p>
       <w:pPr>
         <w:pStyle w:val="Heading2"/>
       </w:pPr>
-      <w:bookmarkStart w:id="0" w:name="_GoBack"/>
     </w:p>
     <w:p>
       <w:pPr>
@@ -821,7 +820,7 @@
       <w:pPr>
         <w:pStyle w:val="Heading1"/>
       </w:pPr>
-      <w:bookmarkStart w:id="1" w:name="_Toc188859122"/>
+      <w:bookmarkStart w:id="0" w:name="_Toc188859122"/>
       <w:r>
         <w:t>Assignment</w:t>
       </w:r>
@@ -830,51 +829,65 @@
       </w:r>
       <w:r>
         <w:t>1</w:t>
+      </w:r>
+      <w:bookmarkEnd w:id="0"/>
+    </w:p>
+    <w:p>
+      <w:r>
+        <w:t>Develop</w:t>
+      </w:r>
+      <w:r>
+        <w:t xml:space="preserve"> machine learning </w:t>
+      </w:r>
+      <w:r>
+        <w:t xml:space="preserve">predictive </w:t>
+      </w:r>
+      <w:r>
+        <w:t>models</w:t>
+      </w:r>
+      <w:r>
+        <w:t xml:space="preserve"> for any</w:t>
+      </w:r>
+      <w:r>
+        <w:t xml:space="preserve"> data set that interests you</w:t>
+      </w:r>
+      <w:r>
+        <w:t xml:space="preserve"> </w:t>
+      </w:r>
+      <w:r>
+        <w:t>provided that the data set has</w:t>
+      </w:r>
+      <w:r>
+        <w:t xml:space="preserve"> not been covered in the Predictive Analytics option. </w:t>
+      </w:r>
+    </w:p>
+    <w:p/>
+    <w:p>
+      <w:pPr>
+        <w:pStyle w:val="Heading2"/>
+        <w:rPr>
+          <w:highlight w:val="green"/>
+        </w:rPr>
+      </w:pPr>
+      <w:bookmarkStart w:id="1" w:name="_Toc188859123"/>
+      <w:r>
+        <w:rPr>
+          <w:highlight w:val="green"/>
+        </w:rPr>
+        <w:t>Finding Data</w:t>
       </w:r>
       <w:bookmarkEnd w:id="1"/>
     </w:p>
     <w:p>
-      <w:r>
-        <w:t>Develop</w:t>
-      </w:r>
-      <w:r>
-        <w:t xml:space="preserve"> machine learning </w:t>
-      </w:r>
-      <w:r>
-        <w:t xml:space="preserve">predictive </w:t>
-      </w:r>
-      <w:r>
-        <w:t>models</w:t>
-      </w:r>
-      <w:r>
-        <w:t xml:space="preserve"> for any</w:t>
-      </w:r>
-      <w:r>
-        <w:t xml:space="preserve"> data set that interests you</w:t>
-      </w:r>
-      <w:r>
-        <w:t xml:space="preserve"> </w:t>
-      </w:r>
-      <w:r>
-        <w:t>provided that the data set has</w:t>
-      </w:r>
-      <w:r>
-        <w:t xml:space="preserve"> not been covered in the Predictive Analytics option. </w:t>
-      </w:r>
-    </w:p>
-    <w:p/>
-    <w:p>
-      <w:pPr>
-        <w:pStyle w:val="Heading2"/>
-      </w:pPr>
-      <w:bookmarkStart w:id="2" w:name="_Toc188859123"/>
-      <w:r>
-        <w:t>Finding Data</w:t>
-      </w:r>
-      <w:bookmarkEnd w:id="2"/>
-    </w:p>
-    <w:p>
-      <w:r>
+      <w:pPr>
+        <w:rPr>
+          <w:highlight w:val="green"/>
+        </w:rPr>
+      </w:pPr>
+      <w:r>
+        <w:rPr>
+          <w:highlight w:val="green"/>
+        </w:rPr>
         <w:t>You can find data at:</w:t>
       </w:r>
     </w:p>
@@ -885,11 +898,15 @@
           <w:ilvl w:val="0"/>
           <w:numId w:val="2"/>
         </w:numPr>
+        <w:rPr>
+          <w:highlight w:val="green"/>
+        </w:rPr>
       </w:pPr>
       <w:hyperlink r:id="rId6" w:history="1">
         <w:r>
           <w:rPr>
             <w:rStyle w:val="Hyperlink"/>
+            <w:highlight w:val="green"/>
           </w:rPr>
           <w:t>https://data.world/search</w:t>
         </w:r>
@@ -902,11 +919,15 @@
           <w:ilvl w:val="0"/>
           <w:numId w:val="2"/>
         </w:numPr>
+        <w:rPr>
+          <w:highlight w:val="green"/>
+        </w:rPr>
       </w:pPr>
       <w:hyperlink r:id="rId7" w:history="1">
         <w:r>
           <w:rPr>
             <w:rStyle w:val="Hyperlink"/>
+            <w:highlight w:val="green"/>
           </w:rPr>
           <w:t>https://www.kaggle.com/datasets</w:t>
         </w:r>
@@ -919,8 +940,14 @@
           <w:ilvl w:val="0"/>
           <w:numId w:val="2"/>
         </w:numPr>
-      </w:pPr>
-      <w:r>
+        <w:rPr>
+          <w:highlight w:val="green"/>
+        </w:rPr>
+      </w:pPr>
+      <w:r>
+        <w:rPr>
+          <w:highlight w:val="green"/>
+        </w:rPr>
         <w:t>Web scraping</w:t>
       </w:r>
     </w:p>
@@ -931,8 +958,14 @@
           <w:ilvl w:val="0"/>
           <w:numId w:val="2"/>
         </w:numPr>
-      </w:pPr>
-      <w:r>
+        <w:rPr>
+          <w:highlight w:val="green"/>
+        </w:rPr>
+      </w:pPr>
+      <w:r>
+        <w:rPr>
+          <w:highlight w:val="green"/>
+        </w:rPr>
         <w:t>API’s</w:t>
       </w:r>
     </w:p>
@@ -941,14 +974,14 @@
       <w:pPr>
         <w:pStyle w:val="Heading2"/>
       </w:pPr>
-      <w:bookmarkStart w:id="3" w:name="_Toc188859124"/>
+      <w:bookmarkStart w:id="2" w:name="_Toc188859124"/>
       <w:r>
         <w:t xml:space="preserve">Report </w:t>
       </w:r>
       <w:r>
         <w:t>Submission Instructions:</w:t>
       </w:r>
-      <w:bookmarkEnd w:id="3"/>
+      <w:bookmarkEnd w:id="2"/>
     </w:p>
     <w:p>
       <w:r>
@@ -990,22 +1023,49 @@
           <w:ilvl w:val="0"/>
           <w:numId w:val="3"/>
         </w:numPr>
-      </w:pPr>
-      <w:bookmarkStart w:id="4" w:name="_Toc188859125"/>
-      <w:r>
+        <w:rPr>
+          <w:highlight w:val="green"/>
+        </w:rPr>
+      </w:pPr>
+      <w:bookmarkStart w:id="3" w:name="_Toc188859125"/>
+      <w:r>
+        <w:rPr>
+          <w:highlight w:val="green"/>
+        </w:rPr>
         <w:t>Problem Definition</w:t>
       </w:r>
       <w:r>
+        <w:rPr>
+          <w:highlight w:val="green"/>
+        </w:rPr>
         <w:t xml:space="preserve"> (5 marks)</w:t>
       </w:r>
-      <w:bookmarkEnd w:id="4"/>
+      <w:bookmarkEnd w:id="3"/>
     </w:p>
     <w:p>
       <w:r>
+        <w:rPr>
+          <w:highlight w:val="green"/>
+        </w:rPr>
         <w:t>Explain</w:t>
       </w:r>
       <w:r>
-        <w:t xml:space="preserve"> the problem you are trying to solve.</w:t>
+        <w:rPr>
+          <w:highlight w:val="green"/>
+        </w:rPr>
+        <w:t xml:space="preserve"> the problem you are trying to </w:t>
+      </w:r>
+      <w:r>
+        <w:rPr>
+          <w:highlight w:val="green"/>
+        </w:rPr>
+        <w:tab/>
+      </w:r>
+      <w:r>
+        <w:rPr>
+          <w:highlight w:val="green"/>
+        </w:rPr>
+        <w:t>solve.</w:t>
       </w:r>
     </w:p>
     <w:p/>
@@ -1017,7 +1077,7 @@
           <w:numId w:val="3"/>
         </w:numPr>
       </w:pPr>
-      <w:bookmarkStart w:id="5" w:name="_Toc188859126"/>
+      <w:bookmarkStart w:id="4" w:name="_Toc188859126"/>
       <w:r>
         <w:t>Exploratory Data Analysis</w:t>
       </w:r>
@@ -1030,7 +1090,7 @@
       <w:r>
         <w:t>5 marks)</w:t>
       </w:r>
-      <w:bookmarkEnd w:id="5"/>
+      <w:bookmarkEnd w:id="4"/>
     </w:p>
     <w:p>
       <w:r>
@@ -1067,7 +1127,16 @@
         <w:t xml:space="preserve">and at the start of the report, </w:t>
       </w:r>
       <w:r>
-        <w:t>identify the best model features in your pool and be sure to focus on the relevant important features in your exploration and visualizations.</w:t>
+        <w:t xml:space="preserve">identify the best model features in your pool and be sure to focus on the </w:t>
+      </w:r>
+      <w:r>
+        <w:rPr>
+          <w:highlight w:val="green"/>
+        </w:rPr>
+        <w:t>relevant important features in your exploration and visualizations</w:t>
+      </w:r>
+      <w:r>
+        <w:t>.</w:t>
       </w:r>
       <w:r>
         <w:t xml:space="preserve"> Show the histograms for all features of the best model.</w:t>
@@ -1092,7 +1161,13 @@
         <w:t xml:space="preserve"> </w:t>
       </w:r>
       <w:r>
-        <w:t xml:space="preserve">Use visualizations to how the best model features are related to the target. Do not only show a heat map. </w:t>
+        <w:rPr>
+          <w:highlight w:val="green"/>
+        </w:rPr>
+        <w:t>Use visualizations to how the best model features are related to the target. Do not only show a heat map.</w:t>
+      </w:r>
+      <w:r>
+        <w:t xml:space="preserve"> </w:t>
       </w:r>
     </w:p>
     <w:p/>
@@ -1104,14 +1179,14 @@
           <w:numId w:val="3"/>
         </w:numPr>
       </w:pPr>
-      <w:bookmarkStart w:id="6" w:name="_Toc188859127"/>
+      <w:bookmarkStart w:id="5" w:name="_Toc188859127"/>
       <w:r>
         <w:t>Model</w:t>
       </w:r>
       <w:r>
         <w:t xml:space="preserve"> Development and Tuning (10 marks)</w:t>
       </w:r>
-      <w:bookmarkEnd w:id="6"/>
+      <w:bookmarkEnd w:id="5"/>
     </w:p>
     <w:p>
       <w:r>
@@ -1168,6 +1243,9 @@
           <w:ilvl w:val="1"/>
           <w:numId w:val="4"/>
         </w:numPr>
+        <w:rPr>
+          <w:highlight w:val="yellow"/>
+        </w:rPr>
       </w:pPr>
       <w:proofErr w:type="spellStart"/>
       <w:r>
@@ -1176,10 +1254,14 @@
           <w:color w:val="000000"/>
           <w:sz w:val="18"/>
           <w:szCs w:val="18"/>
+          <w:highlight w:val="yellow"/>
         </w:rPr>
         <w:t>B</w:t>
       </w:r>
       <w:r>
+        <w:rPr>
+          <w:highlight w:val="yellow"/>
+        </w:rPr>
         <w:t>aggingClassifier</w:t>
       </w:r>
       <w:proofErr w:type="spellEnd"/>
@@ -1214,31 +1296,58 @@
           <w:ilvl w:val="0"/>
           <w:numId w:val="4"/>
         </w:numPr>
-      </w:pPr>
-      <w:r>
+        <w:rPr>
+          <w:highlight w:val="yellow"/>
+        </w:rPr>
+      </w:pPr>
+      <w:r>
+        <w:rPr>
+          <w:highlight w:val="yellow"/>
+        </w:rPr>
         <w:t xml:space="preserve">A </w:t>
       </w:r>
       <w:r>
+        <w:rPr>
+          <w:highlight w:val="yellow"/>
+        </w:rPr>
         <w:t xml:space="preserve">voting </w:t>
       </w:r>
       <w:r>
+        <w:rPr>
+          <w:highlight w:val="yellow"/>
+        </w:rPr>
         <w:t xml:space="preserve">or </w:t>
       </w:r>
       <w:proofErr w:type="spellStart"/>
       <w:r>
+        <w:rPr>
+          <w:highlight w:val="yellow"/>
+        </w:rPr>
         <w:t>mlextend</w:t>
       </w:r>
       <w:proofErr w:type="spellEnd"/>
       <w:r>
+        <w:rPr>
+          <w:highlight w:val="yellow"/>
+        </w:rPr>
         <w:t xml:space="preserve"> </w:t>
       </w:r>
       <w:r>
+        <w:rPr>
+          <w:highlight w:val="yellow"/>
+        </w:rPr>
         <w:t xml:space="preserve">ensemble model that uses several models of different </w:t>
       </w:r>
       <w:r>
+        <w:rPr>
+          <w:highlight w:val="yellow"/>
+        </w:rPr>
         <w:t>types using either</w:t>
       </w:r>
       <w:r>
+        <w:rPr>
+          <w:highlight w:val="yellow"/>
+        </w:rPr>
         <w:t>.</w:t>
       </w:r>
     </w:p>
@@ -1249,20 +1358,38 @@
           <w:ilvl w:val="0"/>
           <w:numId w:val="4"/>
         </w:numPr>
-      </w:pPr>
-      <w:r>
+        <w:rPr>
+          <w:highlight w:val="yellow"/>
+        </w:rPr>
+      </w:pPr>
+      <w:r>
+        <w:rPr>
+          <w:highlight w:val="yellow"/>
+        </w:rPr>
         <w:t>A stacked mode</w:t>
       </w:r>
       <w:r>
+        <w:rPr>
+          <w:highlight w:val="yellow"/>
+        </w:rPr>
         <w:t>l</w:t>
       </w:r>
       <w:r>
+        <w:rPr>
+          <w:highlight w:val="yellow"/>
+        </w:rPr>
         <w:t xml:space="preserve">. </w:t>
       </w:r>
       <w:r>
+        <w:rPr>
+          <w:highlight w:val="yellow"/>
+        </w:rPr>
         <w:t xml:space="preserve"> </w:t>
       </w:r>
       <w:r>
+        <w:rPr>
+          <w:highlight w:val="yellow"/>
+        </w:rPr>
         <w:t>Please use the technique that was demonstrated either in example 6 or example 7 of lesson week 3, COMP4948.</w:t>
       </w:r>
     </w:p>
@@ -1273,11 +1400,20 @@
           <w:ilvl w:val="0"/>
           <w:numId w:val="4"/>
         </w:numPr>
-      </w:pPr>
-      <w:r>
+        <w:rPr>
+          <w:highlight w:val="yellow"/>
+        </w:rPr>
+      </w:pPr>
+      <w:r>
+        <w:rPr>
+          <w:highlight w:val="yellow"/>
+        </w:rPr>
         <w:t>Linear regression or logistic regression</w:t>
       </w:r>
       <w:r>
+        <w:rPr>
+          <w:highlight w:val="yellow"/>
+        </w:rPr>
         <w:t xml:space="preserve"> as appropriate.</w:t>
       </w:r>
     </w:p>
@@ -1302,11 +1438,11 @@
           <w:numId w:val="3"/>
         </w:numPr>
       </w:pPr>
-      <w:bookmarkStart w:id="7" w:name="_Toc188859128"/>
+      <w:bookmarkStart w:id="6" w:name="_Toc188859128"/>
       <w:r>
         <w:t>Model Evaluation (10 marks)</w:t>
       </w:r>
-      <w:bookmarkEnd w:id="7"/>
+      <w:bookmarkEnd w:id="6"/>
     </w:p>
     <w:p>
       <w:r>
@@ -1725,7 +1861,7 @@
           <w:numId w:val="3"/>
         </w:numPr>
       </w:pPr>
-      <w:bookmarkStart w:id="8" w:name="_Toc188859129"/>
+      <w:bookmarkStart w:id="7" w:name="_Toc188859129"/>
       <w:r>
         <w:t xml:space="preserve">Code </w:t>
       </w:r>
@@ -1735,7 +1871,7 @@
       <w:r>
         <w:t>(10 marks)</w:t>
       </w:r>
-      <w:bookmarkEnd w:id="8"/>
+      <w:bookmarkEnd w:id="7"/>
     </w:p>
     <w:p/>
     <w:p>
@@ -1803,29 +1939,43 @@
       <w:pPr>
         <w:pStyle w:val="Heading3"/>
       </w:pPr>
-      <w:bookmarkStart w:id="9" w:name="_Toc188859130"/>
+      <w:bookmarkStart w:id="8" w:name="_Toc188859130"/>
       <w:r>
         <w:t>Restrictions</w:t>
       </w:r>
-      <w:bookmarkEnd w:id="9"/>
+      <w:bookmarkEnd w:id="8"/>
     </w:p>
     <w:p>
       <w:r>
+        <w:rPr>
+          <w:highlight w:val="green"/>
+        </w:rPr>
         <w:t xml:space="preserve">Do not use data sets that are covered in the class. </w:t>
       </w:r>
       <w:r>
+        <w:rPr>
+          <w:highlight w:val="green"/>
+        </w:rPr>
         <w:t>Please d</w:t>
       </w:r>
       <w:r>
+        <w:rPr>
+          <w:highlight w:val="green"/>
+        </w:rPr>
         <w:t xml:space="preserve">o not use the same type of model that you use for any of your other assignments in </w:t>
       </w:r>
       <w:r>
+        <w:rPr>
+          <w:highlight w:val="green"/>
+        </w:rPr>
         <w:t xml:space="preserve">COMP3948, </w:t>
       </w:r>
       <w:r>
+        <w:rPr>
+          <w:highlight w:val="green"/>
+        </w:rPr>
         <w:t>COMP4948 and COMP4949.</w:t>
       </w:r>
-      <w:bookmarkEnd w:id="0"/>
     </w:p>
     <w:sectPr>
       <w:pgSz w:w="12240" w:h="15840"/>
@@ -1838,7 +1988,7 @@
 </file>
 
 <file path=word/numbering.xml><?xml version="1.0" encoding="utf-8"?>
-<w:numbering xmlns:wpc="http://schemas.microsoft.com/office/word/2010/wordprocessingCanvas" xmlns:cx="http://schemas.microsoft.com/office/drawing/2014/chartex" xmlns:cx1="http://schemas.microsoft.com/office/drawing/2015/9/8/chartex" xmlns:cx2="http://schemas.microsoft.com/office/drawing/2015/10/21/chartex" xmlns:cx3="http://schemas.microsoft.com/office/drawing/2016/5/9/chartex" xmlns:cx4="http://schemas.microsoft.com/office/drawing/2016/5/10/chartex" xmlns:cx5="http://schemas.microsoft.com/office/drawing/2016/5/11/chartex" xmlns:cx6="http://schemas.microsoft.com/office/drawing/2016/5/12/chartex" xmlns:cx7="http://schemas.microsoft.com/office/drawing/2016/5/13/chartex" xmlns:cx8="http://schemas.microsoft.com/office/drawing/2016/5/14/chartex" xmlns:mc="http://schemas.openxmlformats.org/markup-compatibility/2006" xmlns:aink="http://schemas.microsoft.com/office/drawing/2016/ink" xmlns:am3d="http://schemas.microsoft.com/office/drawing/2017/model3d" xmlns:o="urn:schemas-microsoft-com:office:office" xmlns:r="http://schemas.openxmlformats.org/officeDocument/2006/relationships" xmlns:m="http://schemas.openxmlformats.org/officeDocument/2006/math" xmlns:v="urn:schemas-microsoft-com:vml" xmlns:wp14="http://schemas.microsoft.com/office/word/2010/wordprocessingDrawing" xmlns:wp="http://schemas.openxmlformats.org/drawingml/2006/wordprocessingDrawing" xmlns:w10="urn:schemas-microsoft-com:office:word" xmlns:w="http://schemas.openxmlformats.org/wordprocessingml/2006/main" xmlns:w14="http://schemas.microsoft.com/office/word/2010/wordml" xmlns:w15="http://schemas.microsoft.com/office/word/2012/wordml" xmlns:w16cid="http://schemas.microsoft.com/office/word/2016/wordml/cid" xmlns:w16se="http://schemas.microsoft.com/office/word/2015/wordml/symex" xmlns:wpg="http://schemas.microsoft.com/office/word/2010/wordprocessingGroup" xmlns:wpi="http://schemas.microsoft.com/office/word/2010/wordprocessingInk" xmlns:wne="http://schemas.microsoft.com/office/word/2006/wordml" xmlns:wps="http://schemas.microsoft.com/office/word/2010/wordprocessingShape" mc:Ignorable="w14 w15 w16se w16cid wp14">
+<w:numbering xmlns:wpc="http://schemas.microsoft.com/office/word/2010/wordprocessingCanvas" xmlns:cx="http://schemas.microsoft.com/office/drawing/2014/chartex" xmlns:cx1="http://schemas.microsoft.com/office/drawing/2015/9/8/chartex" xmlns:cx2="http://schemas.microsoft.com/office/drawing/2015/10/21/chartex" xmlns:cx3="http://schemas.microsoft.com/office/drawing/2016/5/9/chartex" xmlns:cx4="http://schemas.microsoft.com/office/drawing/2016/5/10/chartex" xmlns:cx5="http://schemas.microsoft.com/office/drawing/2016/5/11/chartex" xmlns:cx6="http://schemas.microsoft.com/office/drawing/2016/5/12/chartex" xmlns:cx7="http://schemas.microsoft.com/office/drawing/2016/5/13/chartex" xmlns:cx8="http://schemas.microsoft.com/office/drawing/2016/5/14/chartex" xmlns:mc="http://schemas.openxmlformats.org/markup-compatibility/2006" xmlns:aink="http://schemas.microsoft.com/office/drawing/2016/ink" xmlns:am3d="http://schemas.microsoft.com/office/drawing/2017/model3d" xmlns:o="urn:schemas-microsoft-com:office:office" xmlns:oel="http://schemas.microsoft.com/office/2019/extlst" xmlns:r="http://schemas.openxmlformats.org/officeDocument/2006/relationships" xmlns:m="http://schemas.openxmlformats.org/officeDocument/2006/math" xmlns:v="urn:schemas-microsoft-com:vml" xmlns:wp14="http://schemas.microsoft.com/office/word/2010/wordprocessingDrawing" xmlns:wp="http://schemas.openxmlformats.org/drawingml/2006/wordprocessingDrawing" xmlns:w10="urn:schemas-microsoft-com:office:word" xmlns:w="http://schemas.openxmlformats.org/wordprocessingml/2006/main" xmlns:w14="http://schemas.microsoft.com/office/word/2010/wordml" xmlns:w15="http://schemas.microsoft.com/office/word/2012/wordml" xmlns:w16cex="http://schemas.microsoft.com/office/word/2018/wordml/cex" xmlns:w16cid="http://schemas.microsoft.com/office/word/2016/wordml/cid" xmlns:w16="http://schemas.microsoft.com/office/word/2018/wordml" xmlns:w16du="http://schemas.microsoft.com/office/word/2023/wordml/word16du" xmlns:w16sdtdh="http://schemas.microsoft.com/office/word/2020/wordml/sdtdatahash" xmlns:w16sdtfl="http://schemas.microsoft.com/office/word/2024/wordml/sdtformatlock" xmlns:w16se="http://schemas.microsoft.com/office/word/2015/wordml/symex" xmlns:wpg="http://schemas.microsoft.com/office/word/2010/wordprocessingGroup" xmlns:wpi="http://schemas.microsoft.com/office/word/2010/wordprocessingInk" xmlns:wne="http://schemas.microsoft.com/office/word/2006/wordml" xmlns:wps="http://schemas.microsoft.com/office/word/2010/wordprocessingShape" mc:Ignorable="w14 w15 w16se w16cid w16 w16cex w16sdtdh w16sdtfl w16du wp14">
   <w:abstractNum w:abstractNumId="0" w15:restartNumberingAfterBreak="0">
     <w:nsid w:val="043C32A0"/>
     <w:multiLevelType w:val="hybridMultilevel"/>
@@ -2606,32 +2756,32 @@
       </w:rPr>
     </w:lvl>
   </w:abstractNum>
-  <w:num w:numId="1">
+  <w:num w:numId="1" w16cid:durableId="1220628287">
     <w:abstractNumId w:val="6"/>
   </w:num>
-  <w:num w:numId="2">
+  <w:num w:numId="2" w16cid:durableId="842934905">
     <w:abstractNumId w:val="0"/>
   </w:num>
-  <w:num w:numId="3">
+  <w:num w:numId="3" w16cid:durableId="871066429">
     <w:abstractNumId w:val="4"/>
   </w:num>
-  <w:num w:numId="4">
+  <w:num w:numId="4" w16cid:durableId="2112704473">
     <w:abstractNumId w:val="5"/>
   </w:num>
-  <w:num w:numId="5">
+  <w:num w:numId="5" w16cid:durableId="531263496">
     <w:abstractNumId w:val="3"/>
   </w:num>
-  <w:num w:numId="6">
+  <w:num w:numId="6" w16cid:durableId="2067991331">
     <w:abstractNumId w:val="1"/>
   </w:num>
-  <w:num w:numId="7">
+  <w:num w:numId="7" w16cid:durableId="417752773">
     <w:abstractNumId w:val="2"/>
   </w:num>
 </w:numbering>
 </file>
 
 <file path=word/styles.xml><?xml version="1.0" encoding="utf-8"?>
-<w:styles xmlns:mc="http://schemas.openxmlformats.org/markup-compatibility/2006" xmlns:r="http://schemas.openxmlformats.org/officeDocument/2006/relationships" xmlns:w="http://schemas.openxmlformats.org/wordprocessingml/2006/main" xmlns:w14="http://schemas.microsoft.com/office/word/2010/wordml" xmlns:w15="http://schemas.microsoft.com/office/word/2012/wordml" xmlns:w16cid="http://schemas.microsoft.com/office/word/2016/wordml/cid" xmlns:w16se="http://schemas.microsoft.com/office/word/2015/wordml/symex" mc:Ignorable="w14 w15 w16se w16cid">
+<w:styles xmlns:mc="http://schemas.openxmlformats.org/markup-compatibility/2006" xmlns:r="http://schemas.openxmlformats.org/officeDocument/2006/relationships" xmlns:w="http://schemas.openxmlformats.org/wordprocessingml/2006/main" xmlns:w14="http://schemas.microsoft.com/office/word/2010/wordml" xmlns:w15="http://schemas.microsoft.com/office/word/2012/wordml" xmlns:w16cex="http://schemas.microsoft.com/office/word/2018/wordml/cex" xmlns:w16cid="http://schemas.microsoft.com/office/word/2016/wordml/cid" xmlns:w16="http://schemas.microsoft.com/office/word/2018/wordml" xmlns:w16du="http://schemas.microsoft.com/office/word/2023/wordml/word16du" xmlns:w16sdtdh="http://schemas.microsoft.com/office/word/2020/wordml/sdtdatahash" xmlns:w16sdtfl="http://schemas.microsoft.com/office/word/2024/wordml/sdtformatlock" xmlns:w16se="http://schemas.microsoft.com/office/word/2015/wordml/symex" mc:Ignorable="w14 w15 w16se w16cid w16 w16cex w16sdtdh w16sdtfl w16du">
   <w:docDefaults>
     <w:rPrDefault>
       <w:rPr>
@@ -2643,7 +2793,7 @@
     </w:rPrDefault>
     <w:pPrDefault/>
   </w:docDefaults>
-  <w:latentStyles w:defLockedState="0" w:defUIPriority="99" w:defSemiHidden="0" w:defUnhideWhenUsed="0" w:defQFormat="0" w:count="375">
+  <w:latentStyles w:defLockedState="0" w:defUIPriority="99" w:defSemiHidden="0" w:defUnhideWhenUsed="0" w:defQFormat="0" w:count="376">
     <w:lsdException w:name="Normal" w:uiPriority="0" w:qFormat="1"/>
     <w:lsdException w:name="heading 1" w:uiPriority="9" w:qFormat="1"/>
     <w:lsdException w:name="heading 2" w:semiHidden="1" w:uiPriority="9" w:unhideWhenUsed="1" w:qFormat="1"/>
@@ -3019,6 +3169,7 @@
     <w:lsdException w:name="Smart Hyperlink" w:semiHidden="1" w:unhideWhenUsed="1"/>
     <w:lsdException w:name="Hashtag" w:semiHidden="1" w:unhideWhenUsed="1"/>
     <w:lsdException w:name="Unresolved Mention" w:semiHidden="1" w:unhideWhenUsed="1"/>
+    <w:lsdException w:name="Smart Link" w:semiHidden="1" w:unhideWhenUsed="1"/>
   </w:latentStyles>
   <w:style w:type="paragraph" w:default="1" w:styleId="Normal">
     <w:name w:val="Normal"/>

</xml_diff>

<commit_message>
Assignment 1 Folder updated - Added Model.py - Feature selection - Bagging Selection - Scaling - Bagging model results 1.txt
</commit_message>
<xml_diff>
--- a/Assignment 1/Assignment 1 outline.docx
+++ b/Assignment 1/Assignment 1 outline.docx
@@ -1244,7 +1244,7 @@
           <w:numId w:val="4"/>
         </w:numPr>
         <w:rPr>
-          <w:highlight w:val="yellow"/>
+          <w:highlight w:val="cyan"/>
         </w:rPr>
       </w:pPr>
       <w:proofErr w:type="spellStart"/>
@@ -1254,13 +1254,13 @@
           <w:color w:val="000000"/>
           <w:sz w:val="18"/>
           <w:szCs w:val="18"/>
-          <w:highlight w:val="yellow"/>
+          <w:highlight w:val="cyan"/>
         </w:rPr>
         <w:t>B</w:t>
       </w:r>
       <w:r>
         <w:rPr>
-          <w:highlight w:val="yellow"/>
+          <w:highlight w:val="cyan"/>
         </w:rPr>
         <w:t>aggingClassifier</w:t>
       </w:r>
@@ -1400,15 +1400,15 @@
           <w:ilvl w:val="0"/>
           <w:numId w:val="4"/>
         </w:numPr>
+      </w:pPr>
+      <w:r>
+        <w:t xml:space="preserve">Linear regression or </w:t>
+      </w:r>
+      <w:r>
         <w:rPr>
           <w:highlight w:val="yellow"/>
         </w:rPr>
-      </w:pPr>
-      <w:r>
-        <w:rPr>
-          <w:highlight w:val="yellow"/>
-        </w:rPr>
-        <w:t>Linear regression or logistic regression</w:t>
+        <w:t>logistic regression</w:t>
       </w:r>
       <w:r>
         <w:rPr>

</xml_diff>

<commit_message>
Completed Assignment 1, Added Week 10 Files & Assignment 2 Files
</commit_message>
<xml_diff>
--- a/Assignment 1/Assignment 1 outline.docx
+++ b/Assignment 1/Assignment 1 outline.docx
@@ -1244,7 +1244,7 @@
           <w:numId w:val="4"/>
         </w:numPr>
         <w:rPr>
-          <w:highlight w:val="cyan"/>
+          <w:highlight w:val="green"/>
         </w:rPr>
       </w:pPr>
       <w:proofErr w:type="spellStart"/>
@@ -1254,13 +1254,13 @@
           <w:color w:val="000000"/>
           <w:sz w:val="18"/>
           <w:szCs w:val="18"/>
-          <w:highlight w:val="cyan"/>
+          <w:highlight w:val="green"/>
         </w:rPr>
         <w:t>B</w:t>
       </w:r>
       <w:r>
         <w:rPr>
-          <w:highlight w:val="cyan"/>
+          <w:highlight w:val="green"/>
         </w:rPr>
         <w:t>aggingClassifier</w:t>
       </w:r>
@@ -1297,56 +1297,56 @@
           <w:numId w:val="4"/>
         </w:numPr>
         <w:rPr>
-          <w:highlight w:val="yellow"/>
-        </w:rPr>
-      </w:pPr>
-      <w:r>
-        <w:rPr>
-          <w:highlight w:val="yellow"/>
+          <w:highlight w:val="green"/>
+        </w:rPr>
+      </w:pPr>
+      <w:r>
+        <w:rPr>
+          <w:highlight w:val="green"/>
         </w:rPr>
         <w:t xml:space="preserve">A </w:t>
       </w:r>
       <w:r>
         <w:rPr>
-          <w:highlight w:val="yellow"/>
+          <w:highlight w:val="green"/>
         </w:rPr>
         <w:t xml:space="preserve">voting </w:t>
       </w:r>
       <w:r>
         <w:rPr>
-          <w:highlight w:val="yellow"/>
+          <w:highlight w:val="green"/>
         </w:rPr>
         <w:t xml:space="preserve">or </w:t>
       </w:r>
       <w:proofErr w:type="spellStart"/>
       <w:r>
         <w:rPr>
-          <w:highlight w:val="yellow"/>
-        </w:rPr>
-        <w:t>mlextend</w:t>
+          <w:highlight w:val="green"/>
+        </w:rPr>
+        <w:t>mlxtend</w:t>
       </w:r>
       <w:proofErr w:type="spellEnd"/>
       <w:r>
         <w:rPr>
-          <w:highlight w:val="yellow"/>
+          <w:highlight w:val="green"/>
         </w:rPr>
         <w:t xml:space="preserve"> </w:t>
       </w:r>
       <w:r>
         <w:rPr>
-          <w:highlight w:val="yellow"/>
+          <w:highlight w:val="green"/>
         </w:rPr>
         <w:t xml:space="preserve">ensemble model that uses several models of different </w:t>
       </w:r>
       <w:r>
         <w:rPr>
-          <w:highlight w:val="yellow"/>
+          <w:highlight w:val="green"/>
         </w:rPr>
         <w:t>types using either</w:t>
       </w:r>
       <w:r>
         <w:rPr>
-          <w:highlight w:val="yellow"/>
+          <w:highlight w:val="green"/>
         </w:rPr>
         <w:t>.</w:t>
       </w:r>
@@ -1359,36 +1359,36 @@
           <w:numId w:val="4"/>
         </w:numPr>
         <w:rPr>
-          <w:highlight w:val="yellow"/>
-        </w:rPr>
-      </w:pPr>
-      <w:r>
-        <w:rPr>
-          <w:highlight w:val="yellow"/>
+          <w:highlight w:val="green"/>
+        </w:rPr>
+      </w:pPr>
+      <w:r>
+        <w:rPr>
+          <w:highlight w:val="green"/>
         </w:rPr>
         <w:t>A stacked mode</w:t>
       </w:r>
       <w:r>
         <w:rPr>
-          <w:highlight w:val="yellow"/>
+          <w:highlight w:val="green"/>
         </w:rPr>
         <w:t>l</w:t>
       </w:r>
       <w:r>
         <w:rPr>
-          <w:highlight w:val="yellow"/>
+          <w:highlight w:val="green"/>
         </w:rPr>
         <w:t xml:space="preserve">. </w:t>
       </w:r>
       <w:r>
         <w:rPr>
-          <w:highlight w:val="yellow"/>
+          <w:highlight w:val="green"/>
         </w:rPr>
         <w:t xml:space="preserve"> </w:t>
       </w:r>
       <w:r>
         <w:rPr>
-          <w:highlight w:val="yellow"/>
+          <w:highlight w:val="green"/>
         </w:rPr>
         <w:t>Please use the technique that was demonstrated either in example 6 or example 7 of lesson week 3, COMP4948.</w:t>
       </w:r>
@@ -1406,15 +1406,21 @@
       </w:r>
       <w:r>
         <w:rPr>
+          <w:highlight w:val="green"/>
+        </w:rPr>
+        <w:t>logistic regression</w:t>
+      </w:r>
+      <w:r>
+        <w:rPr>
+          <w:highlight w:val="green"/>
+        </w:rPr>
+        <w:t xml:space="preserve"> as appropriate</w:t>
+      </w:r>
+      <w:r>
+        <w:rPr>
           <w:highlight w:val="yellow"/>
         </w:rPr>
-        <w:t>logistic regression</w:t>
-      </w:r>
-      <w:r>
-        <w:rPr>
-          <w:highlight w:val="yellow"/>
-        </w:rPr>
-        <w:t xml:space="preserve"> as appropriate.</w:t>
+        <w:t>.</w:t>
       </w:r>
     </w:p>
     <w:p>
@@ -1424,12 +1430,34 @@
           <w:ilvl w:val="0"/>
           <w:numId w:val="4"/>
         </w:numPr>
-      </w:pPr>
-      <w:r>
+        <w:rPr>
+          <w:highlight w:val="green"/>
+        </w:rPr>
+      </w:pPr>
+      <w:r>
+        <w:rPr>
+          <w:highlight w:val="green"/>
+        </w:rPr>
         <w:t xml:space="preserve">Any other model that you are interested in. </w:t>
       </w:r>
-    </w:p>
-    <w:p/>
+      <w:r>
+        <w:rPr>
+          <w:highlight w:val="green"/>
+        </w:rPr>
+        <w:t xml:space="preserve"> -&gt; will be using KNN</w:t>
+      </w:r>
+      <w:r>
+        <w:rPr>
+          <w:highlight w:val="green"/>
+        </w:rPr>
+        <w:t>, LGBM</w:t>
+      </w:r>
+    </w:p>
+    <w:p>
+      <w:r>
+        <w:t xml:space="preserve"> </w:t>
+      </w:r>
+    </w:p>
     <w:p>
       <w:pPr>
         <w:pStyle w:val="Heading3"/>
@@ -1446,17 +1474,29 @@
     </w:p>
     <w:p>
       <w:r>
+        <w:rPr>
+          <w:highlight w:val="green"/>
+        </w:rPr>
         <w:t>Use cross fold validation and remember to split the data into three data sets: Train, Validation and Test. Test should be used as unseen data to evaluate the model after the cross-fold loop.</w:t>
       </w:r>
       <w:r>
+        <w:rPr>
+          <w:highlight w:val="green"/>
+        </w:rPr>
         <w:t xml:space="preserve"> The </w:t>
       </w:r>
       <w:proofErr w:type="gramStart"/>
       <w:r>
+        <w:rPr>
+          <w:highlight w:val="green"/>
+        </w:rPr>
         <w:t>cross fold</w:t>
       </w:r>
       <w:proofErr w:type="gramEnd"/>
       <w:r>
+        <w:rPr>
+          <w:highlight w:val="green"/>
+        </w:rPr>
         <w:t xml:space="preserve"> validation loop for training must use this format:</w:t>
       </w:r>
     </w:p>
@@ -1507,7 +1547,6 @@
               <w:t xml:space="preserve"> </w:t>
             </w:r>
             <w:proofErr w:type="spellStart"/>
-            <w:proofErr w:type="gramStart"/>
             <w:r>
               <w:rPr>
                 <w:rFonts w:ascii="Menlo" w:eastAsia="Times New Roman" w:hAnsi="Menlo" w:cs="Menlo"/>
@@ -1516,18 +1555,7 @@
                 <w:szCs w:val="18"/>
                 <w:lang w:val="en-US"/>
               </w:rPr>
-              <w:t>sklearn.model</w:t>
-            </w:r>
-            <w:proofErr w:type="gramEnd"/>
-            <w:r>
-              <w:rPr>
-                <w:rFonts w:ascii="Menlo" w:eastAsia="Times New Roman" w:hAnsi="Menlo" w:cs="Menlo"/>
-                <w:color w:val="000000"/>
-                <w:sz w:val="18"/>
-                <w:szCs w:val="18"/>
-                <w:lang w:val="en-US"/>
-              </w:rPr>
-              <w:t>_selection</w:t>
+              <w:t>sklearn.model_selection</w:t>
             </w:r>
             <w:proofErr w:type="spellEnd"/>
             <w:r>
@@ -1608,7 +1636,6 @@
               <w:t xml:space="preserve"> = </w:t>
             </w:r>
             <w:proofErr w:type="spellStart"/>
-            <w:proofErr w:type="gramStart"/>
             <w:r>
               <w:rPr>
                 <w:rFonts w:ascii="Menlo" w:eastAsia="Times New Roman" w:hAnsi="Menlo" w:cs="Menlo"/>
@@ -1631,7 +1658,6 @@
               <w:t>(</w:t>
             </w:r>
             <w:proofErr w:type="spellStart"/>
-            <w:proofErr w:type="gramEnd"/>
             <w:r>
               <w:rPr>
                 <w:rFonts w:ascii="Menlo" w:eastAsia="Times New Roman" w:hAnsi="Menlo" w:cs="Menlo"/>
@@ -1771,7 +1797,6 @@
               <w:t xml:space="preserve"> </w:t>
             </w:r>
             <w:proofErr w:type="spellStart"/>
-            <w:proofErr w:type="gramStart"/>
             <w:r>
               <w:rPr>
                 <w:rFonts w:ascii="Menlo" w:eastAsia="Times New Roman" w:hAnsi="Menlo" w:cs="Menlo"/>
@@ -1783,7 +1808,6 @@
               <w:t>kfold.split</w:t>
             </w:r>
             <w:proofErr w:type="spellEnd"/>
-            <w:proofErr w:type="gramEnd"/>
             <w:r>
               <w:rPr>
                 <w:rFonts w:ascii="Menlo" w:eastAsia="Times New Roman" w:hAnsi="Menlo" w:cs="Menlo"/>
@@ -1816,7 +1840,12 @@
         <w:t xml:space="preserve">Please compare </w:t>
       </w:r>
       <w:r>
-        <w:t>the models from the previous step in a table. In th</w:t>
+        <w:t>the models from the previous step in a table.</w:t>
+      </w:r>
+    </w:p>
+    <w:p>
+      <w:r>
+        <w:t>In th</w:t>
       </w:r>
       <w:r>
         <w:t>is</w:t>

</xml_diff>